<commit_message>
update week3,4 efolio document.
</commit_message>
<xml_diff>
--- a/w4/efolio w4.docx
+++ b/w4/efolio w4.docx
@@ -282,6 +282,29 @@
           </wp:inline>
         </w:drawing>
       </w:r>
+    </w:p>
+    <w:p>
+      <w:pPr>
+        <w:rPr>
+          <w:rFonts w:hint="default" w:eastAsiaTheme="minorEastAsia"/>
+          <w:lang w:val="en-US" w:eastAsia="zh-CN"/>
+        </w:rPr>
+      </w:pPr>
+      <w:r>
+        <w:rPr>
+          <w:rFonts w:hint="eastAsia"/>
+          <w:lang w:val="en-US" w:eastAsia="zh-CN"/>
+        </w:rPr>
+        <w:t>Task4.2</w:t>
+      </w:r>
+    </w:p>
+    <w:p>
+      <w:pPr>
+        <w:rPr>
+          <w:rFonts w:hint="default"/>
+          <w:lang w:val="en-US"/>
+        </w:rPr>
+      </w:pPr>
       <w:r>
         <w:drawing>
           <wp:inline distT="0" distB="0" distL="114300" distR="114300">
@@ -766,12 +789,138 @@
           <w:lang w:val="en-US"/>
         </w:rPr>
       </w:pPr>
-      <w:r>
-        <w:rPr>
-          <w:rFonts w:hint="default"/>
-          <w:lang w:val="en-US"/>
-        </w:rPr>
-        <w:t>Task 4.2</w:t>
+      <w:bookmarkStart w:id="0" w:name="_GoBack"/>
+      <w:bookmarkEnd w:id="0"/>
+    </w:p>
+    <w:p>
+      <w:r>
+        <w:drawing>
+          <wp:inline distT="0" distB="0" distL="114300" distR="114300">
+            <wp:extent cx="5261610" cy="2292985"/>
+            <wp:effectExtent l="0" t="0" r="8890" b="5715"/>
+            <wp:docPr id="19" name="图片 13"/>
+            <wp:cNvGraphicFramePr>
+              <a:graphicFrameLocks xmlns:a="http://schemas.openxmlformats.org/drawingml/2006/main" noChangeAspect="1"/>
+            </wp:cNvGraphicFramePr>
+            <a:graphic xmlns:a="http://schemas.openxmlformats.org/drawingml/2006/main">
+              <a:graphicData uri="http://schemas.openxmlformats.org/drawingml/2006/picture">
+                <pic:pic xmlns:pic="http://schemas.openxmlformats.org/drawingml/2006/picture">
+                  <pic:nvPicPr>
+                    <pic:cNvPr id="19" name="图片 13"/>
+                    <pic:cNvPicPr>
+                      <a:picLocks noChangeAspect="1"/>
+                    </pic:cNvPicPr>
+                  </pic:nvPicPr>
+                  <pic:blipFill>
+                    <a:blip r:embed="rId21"/>
+                    <a:stretch>
+                      <a:fillRect/>
+                    </a:stretch>
+                  </pic:blipFill>
+                  <pic:spPr>
+                    <a:xfrm>
+                      <a:off x="0" y="0"/>
+                      <a:ext cx="5261610" cy="2292985"/>
+                    </a:xfrm>
+                    <a:prstGeom prst="rect">
+                      <a:avLst/>
+                    </a:prstGeom>
+                    <a:noFill/>
+                    <a:ln>
+                      <a:noFill/>
+                    </a:ln>
+                  </pic:spPr>
+                </pic:pic>
+              </a:graphicData>
+            </a:graphic>
+          </wp:inline>
+        </w:drawing>
+      </w:r>
+      <w:r>
+        <w:drawing>
+          <wp:inline distT="0" distB="0" distL="114300" distR="114300">
+            <wp:extent cx="5269865" cy="1145540"/>
+            <wp:effectExtent l="0" t="0" r="635" b="10160"/>
+            <wp:docPr id="20" name="图片 14"/>
+            <wp:cNvGraphicFramePr>
+              <a:graphicFrameLocks xmlns:a="http://schemas.openxmlformats.org/drawingml/2006/main" noChangeAspect="1"/>
+            </wp:cNvGraphicFramePr>
+            <a:graphic xmlns:a="http://schemas.openxmlformats.org/drawingml/2006/main">
+              <a:graphicData uri="http://schemas.openxmlformats.org/drawingml/2006/picture">
+                <pic:pic xmlns:pic="http://schemas.openxmlformats.org/drawingml/2006/picture">
+                  <pic:nvPicPr>
+                    <pic:cNvPr id="20" name="图片 14"/>
+                    <pic:cNvPicPr>
+                      <a:picLocks noChangeAspect="1"/>
+                    </pic:cNvPicPr>
+                  </pic:nvPicPr>
+                  <pic:blipFill>
+                    <a:blip r:embed="rId22"/>
+                    <a:stretch>
+                      <a:fillRect/>
+                    </a:stretch>
+                  </pic:blipFill>
+                  <pic:spPr>
+                    <a:xfrm>
+                      <a:off x="0" y="0"/>
+                      <a:ext cx="5269865" cy="1145540"/>
+                    </a:xfrm>
+                    <a:prstGeom prst="rect">
+                      <a:avLst/>
+                    </a:prstGeom>
+                    <a:noFill/>
+                    <a:ln>
+                      <a:noFill/>
+                    </a:ln>
+                  </pic:spPr>
+                </pic:pic>
+              </a:graphicData>
+            </a:graphic>
+          </wp:inline>
+        </w:drawing>
+      </w:r>
+      <w:r>
+        <w:drawing>
+          <wp:inline distT="0" distB="0" distL="114300" distR="114300">
+            <wp:extent cx="4432300" cy="2197100"/>
+            <wp:effectExtent l="0" t="0" r="0" b="0"/>
+            <wp:docPr id="21" name="图片 15"/>
+            <wp:cNvGraphicFramePr>
+              <a:graphicFrameLocks xmlns:a="http://schemas.openxmlformats.org/drawingml/2006/main" noChangeAspect="1"/>
+            </wp:cNvGraphicFramePr>
+            <a:graphic xmlns:a="http://schemas.openxmlformats.org/drawingml/2006/main">
+              <a:graphicData uri="http://schemas.openxmlformats.org/drawingml/2006/picture">
+                <pic:pic xmlns:pic="http://schemas.openxmlformats.org/drawingml/2006/picture">
+                  <pic:nvPicPr>
+                    <pic:cNvPr id="21" name="图片 15"/>
+                    <pic:cNvPicPr>
+                      <a:picLocks noChangeAspect="1"/>
+                    </pic:cNvPicPr>
+                  </pic:nvPicPr>
+                  <pic:blipFill>
+                    <a:blip r:embed="rId23"/>
+                    <a:stretch>
+                      <a:fillRect/>
+                    </a:stretch>
+                  </pic:blipFill>
+                  <pic:spPr>
+                    <a:xfrm>
+                      <a:off x="0" y="0"/>
+                      <a:ext cx="4432300" cy="2197100"/>
+                    </a:xfrm>
+                    <a:prstGeom prst="rect">
+                      <a:avLst/>
+                    </a:prstGeom>
+                    <a:noFill/>
+                    <a:ln>
+                      <a:noFill/>
+                    </a:ln>
+                  </pic:spPr>
+                </pic:pic>
+              </a:graphicData>
+            </a:graphic>
+          </wp:inline>
+        </w:drawing>
       </w:r>
     </w:p>
     <w:p>
@@ -781,42 +930,34 @@
           <w:lang w:val="en-US"/>
         </w:rPr>
       </w:pPr>
-    </w:p>
-    <w:p>
-      <w:pPr>
-        <w:rPr>
-          <w:rFonts w:hint="default"/>
-          <w:lang w:val="en-US"/>
-        </w:rPr>
-      </w:pPr>
-      <w:r>
-        <w:drawing>
-          <wp:inline distT="0" distB="0" distL="114300" distR="114300">
-            <wp:extent cx="5261610" cy="2292985"/>
-            <wp:effectExtent l="0" t="0" r="8890" b="5715"/>
-            <wp:docPr id="19" name="图片 13"/>
-            <wp:cNvGraphicFramePr>
-              <a:graphicFrameLocks xmlns:a="http://schemas.openxmlformats.org/drawingml/2006/main" noChangeAspect="1"/>
-            </wp:cNvGraphicFramePr>
-            <a:graphic xmlns:a="http://schemas.openxmlformats.org/drawingml/2006/main">
-              <a:graphicData uri="http://schemas.openxmlformats.org/drawingml/2006/picture">
-                <pic:pic xmlns:pic="http://schemas.openxmlformats.org/drawingml/2006/picture">
-                  <pic:nvPicPr>
-                    <pic:cNvPr id="19" name="图片 13"/>
-                    <pic:cNvPicPr>
-                      <a:picLocks noChangeAspect="1"/>
-                    </pic:cNvPicPr>
-                  </pic:nvPicPr>
-                  <pic:blipFill>
-                    <a:blip r:embed="rId21"/>
-                    <a:stretch>
-                      <a:fillRect/>
-                    </a:stretch>
-                  </pic:blipFill>
-                  <pic:spPr>
-                    <a:xfrm>
-                      <a:off x="0" y="0"/>
-                      <a:ext cx="5261610" cy="2292985"/>
+      <w:r>
+        <w:drawing>
+          <wp:inline distT="0" distB="0" distL="114300" distR="114300">
+            <wp:extent cx="5272405" cy="2907030"/>
+            <wp:effectExtent l="0" t="0" r="10795" b="1270"/>
+            <wp:docPr id="7" name="图片 1"/>
+            <wp:cNvGraphicFramePr>
+              <a:graphicFrameLocks xmlns:a="http://schemas.openxmlformats.org/drawingml/2006/main" noChangeAspect="1"/>
+            </wp:cNvGraphicFramePr>
+            <a:graphic xmlns:a="http://schemas.openxmlformats.org/drawingml/2006/main">
+              <a:graphicData uri="http://schemas.openxmlformats.org/drawingml/2006/picture">
+                <pic:pic xmlns:pic="http://schemas.openxmlformats.org/drawingml/2006/picture">
+                  <pic:nvPicPr>
+                    <pic:cNvPr id="7" name="图片 1"/>
+                    <pic:cNvPicPr>
+                      <a:picLocks noChangeAspect="1"/>
+                    </pic:cNvPicPr>
+                  </pic:nvPicPr>
+                  <pic:blipFill>
+                    <a:blip r:embed="rId24"/>
+                    <a:stretch>
+                      <a:fillRect/>
+                    </a:stretch>
+                  </pic:blipFill>
+                  <pic:spPr>
+                    <a:xfrm>
+                      <a:off x="0" y="0"/>
+                      <a:ext cx="5272405" cy="2907030"/>
                     </a:xfrm>
                     <a:prstGeom prst="rect">
                       <a:avLst/>
@@ -832,94 +973,6 @@
           </wp:inline>
         </w:drawing>
       </w:r>
-      <w:r>
-        <w:drawing>
-          <wp:inline distT="0" distB="0" distL="114300" distR="114300">
-            <wp:extent cx="5269865" cy="1145540"/>
-            <wp:effectExtent l="0" t="0" r="635" b="10160"/>
-            <wp:docPr id="20" name="图片 14"/>
-            <wp:cNvGraphicFramePr>
-              <a:graphicFrameLocks xmlns:a="http://schemas.openxmlformats.org/drawingml/2006/main" noChangeAspect="1"/>
-            </wp:cNvGraphicFramePr>
-            <a:graphic xmlns:a="http://schemas.openxmlformats.org/drawingml/2006/main">
-              <a:graphicData uri="http://schemas.openxmlformats.org/drawingml/2006/picture">
-                <pic:pic xmlns:pic="http://schemas.openxmlformats.org/drawingml/2006/picture">
-                  <pic:nvPicPr>
-                    <pic:cNvPr id="20" name="图片 14"/>
-                    <pic:cNvPicPr>
-                      <a:picLocks noChangeAspect="1"/>
-                    </pic:cNvPicPr>
-                  </pic:nvPicPr>
-                  <pic:blipFill>
-                    <a:blip r:embed="rId22"/>
-                    <a:stretch>
-                      <a:fillRect/>
-                    </a:stretch>
-                  </pic:blipFill>
-                  <pic:spPr>
-                    <a:xfrm>
-                      <a:off x="0" y="0"/>
-                      <a:ext cx="5269865" cy="1145540"/>
-                    </a:xfrm>
-                    <a:prstGeom prst="rect">
-                      <a:avLst/>
-                    </a:prstGeom>
-                    <a:noFill/>
-                    <a:ln>
-                      <a:noFill/>
-                    </a:ln>
-                  </pic:spPr>
-                </pic:pic>
-              </a:graphicData>
-            </a:graphic>
-          </wp:inline>
-        </w:drawing>
-      </w:r>
-      <w:r>
-        <w:drawing>
-          <wp:inline distT="0" distB="0" distL="114300" distR="114300">
-            <wp:extent cx="4432300" cy="2197100"/>
-            <wp:effectExtent l="0" t="0" r="0" b="0"/>
-            <wp:docPr id="21" name="图片 15"/>
-            <wp:cNvGraphicFramePr>
-              <a:graphicFrameLocks xmlns:a="http://schemas.openxmlformats.org/drawingml/2006/main" noChangeAspect="1"/>
-            </wp:cNvGraphicFramePr>
-            <a:graphic xmlns:a="http://schemas.openxmlformats.org/drawingml/2006/main">
-              <a:graphicData uri="http://schemas.openxmlformats.org/drawingml/2006/picture">
-                <pic:pic xmlns:pic="http://schemas.openxmlformats.org/drawingml/2006/picture">
-                  <pic:nvPicPr>
-                    <pic:cNvPr id="21" name="图片 15"/>
-                    <pic:cNvPicPr>
-                      <a:picLocks noChangeAspect="1"/>
-                    </pic:cNvPicPr>
-                  </pic:nvPicPr>
-                  <pic:blipFill>
-                    <a:blip r:embed="rId23"/>
-                    <a:stretch>
-                      <a:fillRect/>
-                    </a:stretch>
-                  </pic:blipFill>
-                  <pic:spPr>
-                    <a:xfrm>
-                      <a:off x="0" y="0"/>
-                      <a:ext cx="4432300" cy="2197100"/>
-                    </a:xfrm>
-                    <a:prstGeom prst="rect">
-                      <a:avLst/>
-                    </a:prstGeom>
-                    <a:noFill/>
-                    <a:ln>
-                      <a:noFill/>
-                    </a:ln>
-                  </pic:spPr>
-                </pic:pic>
-              </a:graphicData>
-            </a:graphic>
-          </wp:inline>
-        </w:drawing>
-      </w:r>
-      <w:bookmarkStart w:id="0" w:name="_GoBack"/>
-      <w:bookmarkEnd w:id="0"/>
     </w:p>
     <w:p>
       <w:pPr>

</xml_diff>